<commit_message>
Update ERD diagram and report based on review
</commit_message>
<xml_diff>
--- a/Homework_2.docx
+++ b/Homework_2.docx
@@ -540,6 +540,152 @@
         <w:rPr>
           <w:lang w:val="en-US"/>
         </w:rPr>
+        <w:t xml:space="preserve">▪ </w:t>
+      </w:r>
+      <w:proofErr w:type="spellStart"/>
+      <w:r>
+        <w:rPr>
+          <w:lang w:val="en-US"/>
+        </w:rPr>
+        <w:t>CategoryName</w:t>
+      </w:r>
+      <w:proofErr w:type="spellEnd"/>
+      <w:r>
+        <w:rPr>
+          <w:lang w:val="en-US"/>
+        </w:rPr>
+        <w:t xml:space="preserve">: </w:t>
+      </w:r>
+      <w:proofErr w:type="gramStart"/>
+      <w:r>
+        <w:rPr>
+          <w:lang w:val="en-US"/>
+        </w:rPr>
+        <w:t>VARCHAR(</w:t>
+      </w:r>
+      <w:proofErr w:type="gramEnd"/>
+      <w:r>
+        <w:rPr>
+          <w:lang w:val="en-US"/>
+        </w:rPr>
+        <w:t xml:space="preserve">100), NOT NULL  </w:t>
+      </w:r>
+    </w:p>
+    <w:p>
+      <w:pPr>
+        <w:spacing w:after="0"/>
+        <w:ind w:left="707" w:firstLine="709"/>
+        <w:jc w:val="both"/>
+        <w:rPr>
+          <w:lang w:val="en-US"/>
+        </w:rPr>
+      </w:pPr>
+      <w:r>
+        <w:rPr>
+          <w:lang w:val="en-US"/>
+        </w:rPr>
+        <w:t xml:space="preserve">▪ </w:t>
+      </w:r>
+      <w:r>
+        <w:rPr>
+          <w:lang w:val="en-US"/>
+        </w:rPr>
+        <w:t xml:space="preserve">Description: TEXT  </w:t>
+      </w:r>
+    </w:p>
+    <w:p>
+      <w:pPr>
+        <w:spacing w:after="0"/>
+        <w:ind w:left="709"/>
+        <w:jc w:val="both"/>
+        <w:rPr>
+          <w:b/>
+          <w:bCs/>
+          <w:lang w:val="en-US"/>
+        </w:rPr>
+      </w:pPr>
+      <w:r>
+        <w:rPr>
+          <w:b/>
+          <w:bCs/>
+          <w:lang w:val="en-US"/>
+        </w:rPr>
+        <w:t xml:space="preserve">     </w:t>
+      </w:r>
+      <w:r>
+        <w:rPr>
+          <w:b/>
+          <w:bCs/>
+          <w:lang w:val="en-US"/>
+        </w:rPr>
+        <w:t>◦</w:t>
+      </w:r>
+      <w:r>
+        <w:rPr>
+          <w:b/>
+          <w:bCs/>
+          <w:lang w:val="en-US"/>
+        </w:rPr>
+        <w:t xml:space="preserve"> Constraints:</w:t>
+      </w:r>
+    </w:p>
+    <w:p>
+      <w:pPr>
+        <w:spacing w:after="0"/>
+        <w:ind w:left="707" w:firstLine="709"/>
+        <w:jc w:val="both"/>
+        <w:rPr>
+          <w:lang w:val="en-US"/>
+        </w:rPr>
+      </w:pPr>
+      <w:r>
+        <w:rPr>
+          <w:lang w:val="en-US"/>
+        </w:rPr>
+        <w:t xml:space="preserve">▪ </w:t>
+      </w:r>
+      <w:proofErr w:type="spellStart"/>
+      <w:r>
+        <w:rPr>
+          <w:lang w:val="en-US"/>
+        </w:rPr>
+        <w:t>PK_Categories</w:t>
+      </w:r>
+      <w:proofErr w:type="spellEnd"/>
+      <w:r>
+        <w:rPr>
+          <w:lang w:val="en-US"/>
+        </w:rPr>
+        <w:t>: PRIMARY KEY (</w:t>
+      </w:r>
+      <w:proofErr w:type="spellStart"/>
+      <w:r>
+        <w:rPr>
+          <w:lang w:val="en-US"/>
+        </w:rPr>
+        <w:t>CategoryID</w:t>
+      </w:r>
+      <w:proofErr w:type="spellEnd"/>
+      <w:r>
+        <w:rPr>
+          <w:lang w:val="en-US"/>
+        </w:rPr>
+        <w:t xml:space="preserve">)  </w:t>
+      </w:r>
+    </w:p>
+    <w:p>
+      <w:pPr>
+        <w:spacing w:after="0"/>
+        <w:ind w:left="707" w:firstLine="709"/>
+        <w:jc w:val="both"/>
+        <w:rPr>
+          <w:lang w:val="en-US"/>
+        </w:rPr>
+      </w:pPr>
+      <w:r>
+        <w:rPr>
+          <w:lang w:val="en-US"/>
+        </w:rPr>
         <w:t>▪</w:t>
       </w:r>
       <w:r>
@@ -553,6 +699,20 @@
         <w:rPr>
           <w:lang w:val="en-US"/>
         </w:rPr>
+        <w:t>UQ_CategoryName</w:t>
+      </w:r>
+      <w:proofErr w:type="spellEnd"/>
+      <w:r>
+        <w:rPr>
+          <w:lang w:val="en-US"/>
+        </w:rPr>
+        <w:t>: UNIQUE (</w:t>
+      </w:r>
+      <w:proofErr w:type="spellStart"/>
+      <w:r>
+        <w:rPr>
+          <w:lang w:val="en-US"/>
+        </w:rPr>
         <w:t>CategoryName</w:t>
       </w:r>
       <w:proofErr w:type="spellEnd"/>
@@ -560,21 +720,161 @@
         <w:rPr>
           <w:lang w:val="en-US"/>
         </w:rPr>
+        <w:t xml:space="preserve">)  </w:t>
+      </w:r>
+    </w:p>
+    <w:p>
+      <w:pPr>
+        <w:spacing w:after="0"/>
+        <w:ind w:firstLine="709"/>
+        <w:jc w:val="both"/>
+        <w:rPr>
+          <w:b/>
+          <w:bCs/>
+          <w:lang w:val="en-US"/>
+        </w:rPr>
+      </w:pPr>
+      <w:r>
+        <w:rPr>
+          <w:b/>
+          <w:bCs/>
+          <w:lang w:val="en-US"/>
+        </w:rPr>
+        <w:t xml:space="preserve">2. </w:t>
+      </w:r>
+      <w:r>
+        <w:rPr>
+          <w:b/>
+          <w:bCs/>
+          <w:lang w:val="en-US"/>
+        </w:rPr>
+        <w:t>Table</w:t>
+      </w:r>
+      <w:r>
+        <w:rPr>
+          <w:b/>
+          <w:bCs/>
+          <w:lang w:val="en-US"/>
+        </w:rPr>
+        <w:t xml:space="preserve"> </w:t>
+      </w:r>
+      <w:r>
+        <w:rPr>
+          <w:b/>
+          <w:bCs/>
+          <w:lang w:val="en-US"/>
+        </w:rPr>
+        <w:t>Name</w:t>
+      </w:r>
+      <w:r>
+        <w:rPr>
+          <w:b/>
+          <w:bCs/>
+          <w:lang w:val="en-US"/>
+        </w:rPr>
         <w:t xml:space="preserve">: </w:t>
       </w:r>
+      <w:r>
+        <w:rPr>
+          <w:b/>
+          <w:bCs/>
+          <w:lang w:val="en-US"/>
+        </w:rPr>
+        <w:t>Products</w:t>
+      </w:r>
+    </w:p>
+    <w:p>
+      <w:pPr>
+        <w:spacing w:after="0"/>
+        <w:jc w:val="both"/>
+      </w:pPr>
+      <w:r>
+        <w:rPr>
+          <w:b/>
+          <w:bCs/>
+          <w:lang w:val="en-US"/>
+        </w:rPr>
+        <w:t xml:space="preserve">                </w:t>
+      </w:r>
+      <w:r>
+        <w:rPr>
+          <w:b/>
+          <w:bCs/>
+        </w:rPr>
+        <w:t>◦</w:t>
+      </w:r>
+      <w:r>
+        <w:rPr>
+          <w:b/>
+          <w:bCs/>
+        </w:rPr>
+        <w:t xml:space="preserve"> </w:t>
+      </w:r>
+      <w:r>
+        <w:rPr>
+          <w:b/>
+          <w:bCs/>
+          <w:lang w:val="en-US"/>
+        </w:rPr>
+        <w:t>Description</w:t>
+      </w:r>
       <w:proofErr w:type="gramStart"/>
       <w:r>
         <w:rPr>
-          <w:lang w:val="en-US"/>
-        </w:rPr>
-        <w:t>VARCHAR(</w:t>
+          <w:b/>
+          <w:bCs/>
+        </w:rPr>
+        <w:t>:</w:t>
+      </w:r>
+      <w:r>
+        <w:t xml:space="preserve"> Содержит</w:t>
       </w:r>
       <w:proofErr w:type="gramEnd"/>
       <w:r>
-        <w:rPr>
-          <w:lang w:val="en-US"/>
-        </w:rPr>
-        <w:t xml:space="preserve">100), NOT NULL  </w:t>
+        <w:t xml:space="preserve"> информацию о товарах магазина.</w:t>
+      </w:r>
+      <w:r>
+        <w:rPr>
+          <w:lang w:val="en-US"/>
+        </w:rPr>
+        <w:t> </w:t>
+      </w:r>
+      <w:r>
+        <w:t xml:space="preserve"> </w:t>
+      </w:r>
+    </w:p>
+    <w:p>
+      <w:pPr>
+        <w:spacing w:after="0"/>
+        <w:jc w:val="both"/>
+        <w:rPr>
+          <w:b/>
+          <w:bCs/>
+          <w:lang w:val="en-US"/>
+        </w:rPr>
+      </w:pPr>
+      <w:r>
+        <w:rPr>
+          <w:b/>
+          <w:bCs/>
+        </w:rPr>
+        <w:t xml:space="preserve">                </w:t>
+      </w:r>
+      <w:r>
+        <w:rPr>
+          <w:b/>
+          <w:bCs/>
+          <w:lang w:val="en-US"/>
+        </w:rPr>
+        <w:t>◦</w:t>
+      </w:r>
+      <w:r>
+        <w:rPr>
+          <w:b/>
+          <w:bCs/>
+          <w:lang w:val="en-US"/>
+        </w:rPr>
+        <w:t xml:space="preserve"> Attributes:</w:t>
       </w:r>
     </w:p>
     <w:p>
@@ -590,319 +890,7 @@
         <w:rPr>
           <w:lang w:val="en-US"/>
         </w:rPr>
-        <w:t>▪</w:t>
-      </w:r>
-      <w:r>
-        <w:rPr>
-          <w:lang w:val="en-US"/>
-        </w:rPr>
-        <w:t xml:space="preserve"> </w:t>
-      </w:r>
-      <w:r>
-        <w:rPr>
-          <w:lang w:val="en-US"/>
-        </w:rPr>
-        <w:t xml:space="preserve">Description: TEXT  </w:t>
-      </w:r>
-    </w:p>
-    <w:p>
-      <w:pPr>
-        <w:spacing w:after="0"/>
-        <w:ind w:left="709"/>
-        <w:jc w:val="both"/>
-        <w:rPr>
-          <w:b/>
-          <w:bCs/>
-          <w:lang w:val="en-US"/>
-        </w:rPr>
-      </w:pPr>
-      <w:r>
-        <w:rPr>
-          <w:b/>
-          <w:bCs/>
-          <w:lang w:val="en-US"/>
-        </w:rPr>
-        <w:t xml:space="preserve">     </w:t>
-      </w:r>
-      <w:r>
-        <w:rPr>
-          <w:b/>
-          <w:bCs/>
-          <w:lang w:val="en-US"/>
-        </w:rPr>
-        <w:t>◦</w:t>
-      </w:r>
-      <w:r>
-        <w:rPr>
-          <w:b/>
-          <w:bCs/>
-          <w:lang w:val="en-US"/>
-        </w:rPr>
-        <w:t xml:space="preserve"> Constraints:</w:t>
-      </w:r>
-    </w:p>
-    <w:p>
-      <w:pPr>
-        <w:spacing w:after="0"/>
-        <w:ind w:left="707" w:firstLine="709"/>
-        <w:jc w:val="both"/>
-        <w:rPr>
-          <w:lang w:val="en-US"/>
-        </w:rPr>
-      </w:pPr>
-      <w:r>
-        <w:rPr>
-          <w:lang w:val="en-US"/>
-        </w:rPr>
-        <w:t>▪</w:t>
-      </w:r>
-      <w:r>
-        <w:rPr>
-          <w:lang w:val="en-US"/>
-        </w:rPr>
-        <w:t xml:space="preserve"> </w:t>
-      </w:r>
-      <w:proofErr w:type="spellStart"/>
-      <w:r>
-        <w:rPr>
-          <w:lang w:val="en-US"/>
-        </w:rPr>
-        <w:t>PK_Categories</w:t>
-      </w:r>
-      <w:proofErr w:type="spellEnd"/>
-      <w:r>
-        <w:rPr>
-          <w:lang w:val="en-US"/>
-        </w:rPr>
-        <w:t>: PRIMARY KEY (</w:t>
-      </w:r>
-      <w:proofErr w:type="spellStart"/>
-      <w:r>
-        <w:rPr>
-          <w:lang w:val="en-US"/>
-        </w:rPr>
-        <w:t>CategoryID</w:t>
-      </w:r>
-      <w:proofErr w:type="spellEnd"/>
-      <w:r>
-        <w:rPr>
-          <w:lang w:val="en-US"/>
-        </w:rPr>
-        <w:t xml:space="preserve">)  </w:t>
-      </w:r>
-    </w:p>
-    <w:p>
-      <w:pPr>
-        <w:spacing w:after="0"/>
-        <w:ind w:left="707" w:firstLine="709"/>
-        <w:jc w:val="both"/>
-      </w:pPr>
-      <w:r>
-        <w:rPr>
-          <w:lang w:val="en-US"/>
-        </w:rPr>
-        <w:t>▪</w:t>
-      </w:r>
-      <w:r>
-        <w:t xml:space="preserve"> </w:t>
-      </w:r>
-      <w:proofErr w:type="spellStart"/>
-      <w:r>
-        <w:rPr>
-          <w:lang w:val="en-US"/>
-        </w:rPr>
-        <w:t>UQ_CategoryName</w:t>
-      </w:r>
-      <w:proofErr w:type="spellEnd"/>
-      <w:r>
-        <w:rPr>
-          <w:lang w:val="en-US"/>
-        </w:rPr>
-        <w:t>: UNIQUE (</w:t>
-      </w:r>
-      <w:proofErr w:type="spellStart"/>
-      <w:r>
-        <w:rPr>
-          <w:lang w:val="en-US"/>
-        </w:rPr>
-        <w:t>CategoryName</w:t>
-      </w:r>
-      <w:proofErr w:type="spellEnd"/>
-      <w:r>
-        <w:rPr>
-          <w:lang w:val="en-US"/>
-        </w:rPr>
-        <w:t xml:space="preserve">)  </w:t>
-      </w:r>
-    </w:p>
-    <w:p>
-      <w:pPr>
-        <w:spacing w:after="0"/>
-        <w:ind w:firstLine="709"/>
-        <w:jc w:val="both"/>
-        <w:rPr>
-          <w:b/>
-          <w:bCs/>
-        </w:rPr>
-      </w:pPr>
-      <w:r>
-        <w:rPr>
-          <w:b/>
-          <w:bCs/>
-        </w:rPr>
-        <w:t xml:space="preserve">2. </w:t>
-      </w:r>
-      <w:r>
-        <w:rPr>
-          <w:b/>
-          <w:bCs/>
-          <w:lang w:val="en-US"/>
-        </w:rPr>
-        <w:t>Table</w:t>
-      </w:r>
-      <w:r>
-        <w:rPr>
-          <w:b/>
-          <w:bCs/>
-        </w:rPr>
-        <w:t xml:space="preserve"> </w:t>
-      </w:r>
-      <w:r>
-        <w:rPr>
-          <w:b/>
-          <w:bCs/>
-          <w:lang w:val="en-US"/>
-        </w:rPr>
-        <w:t>Name</w:t>
-      </w:r>
-      <w:r>
-        <w:rPr>
-          <w:b/>
-          <w:bCs/>
-        </w:rPr>
-        <w:t xml:space="preserve">: </w:t>
-      </w:r>
-      <w:r>
-        <w:rPr>
-          <w:b/>
-          <w:bCs/>
-          <w:lang w:val="en-US"/>
-        </w:rPr>
-        <w:t>Products</w:t>
-      </w:r>
-    </w:p>
-    <w:p>
-      <w:pPr>
-        <w:spacing w:after="0"/>
-        <w:jc w:val="both"/>
-      </w:pPr>
-      <w:r>
-        <w:rPr>
-          <w:b/>
-          <w:bCs/>
-        </w:rPr>
-        <w:t xml:space="preserve">                </w:t>
-      </w:r>
-      <w:r>
-        <w:rPr>
-          <w:b/>
-          <w:bCs/>
-        </w:rPr>
-        <w:t>◦</w:t>
-      </w:r>
-      <w:r>
-        <w:rPr>
-          <w:b/>
-          <w:bCs/>
-        </w:rPr>
-        <w:t xml:space="preserve"> </w:t>
-      </w:r>
-      <w:r>
-        <w:rPr>
-          <w:b/>
-          <w:bCs/>
-          <w:lang w:val="en-US"/>
-        </w:rPr>
-        <w:t>Description</w:t>
-      </w:r>
-      <w:proofErr w:type="gramStart"/>
-      <w:r>
-        <w:rPr>
-          <w:b/>
-          <w:bCs/>
-        </w:rPr>
-        <w:t>:</w:t>
-      </w:r>
-      <w:r>
-        <w:t xml:space="preserve"> Содержит</w:t>
-      </w:r>
-      <w:proofErr w:type="gramEnd"/>
-      <w:r>
-        <w:t xml:space="preserve"> информацию о товарах магазина.</w:t>
-      </w:r>
-      <w:r>
-        <w:rPr>
-          <w:lang w:val="en-US"/>
-        </w:rPr>
-        <w:t> </w:t>
-      </w:r>
-      <w:r>
-        <w:t xml:space="preserve"> </w:t>
-      </w:r>
-    </w:p>
-    <w:p>
-      <w:pPr>
-        <w:spacing w:after="0"/>
-        <w:jc w:val="both"/>
-        <w:rPr>
-          <w:b/>
-          <w:bCs/>
-          <w:lang w:val="en-US"/>
-        </w:rPr>
-      </w:pPr>
-      <w:r>
-        <w:rPr>
-          <w:b/>
-          <w:bCs/>
-        </w:rPr>
-        <w:t xml:space="preserve">                </w:t>
-      </w:r>
-      <w:r>
-        <w:rPr>
-          <w:b/>
-          <w:bCs/>
-        </w:rPr>
-        <w:t>◦</w:t>
-      </w:r>
-      <w:r>
-        <w:rPr>
-          <w:b/>
-          <w:bCs/>
-          <w:lang w:val="en-US"/>
-        </w:rPr>
-        <w:t xml:space="preserve"> Attributes:</w:t>
-      </w:r>
-    </w:p>
-    <w:p>
-      <w:pPr>
-        <w:spacing w:after="0"/>
-        <w:ind w:left="707" w:firstLine="709"/>
-        <w:jc w:val="both"/>
-        <w:rPr>
-          <w:lang w:val="en-US"/>
-        </w:rPr>
-      </w:pPr>
-      <w:r>
-        <w:rPr>
-          <w:lang w:val="en-US"/>
-        </w:rPr>
-        <w:t>▪</w:t>
-      </w:r>
-      <w:r>
-        <w:rPr>
-          <w:lang w:val="en-US"/>
-        </w:rPr>
-        <w:t xml:space="preserve"> </w:t>
+        <w:t xml:space="preserve">▪ </w:t>
       </w:r>
       <w:proofErr w:type="spellStart"/>
       <w:r>
@@ -1449,6 +1437,7 @@
         <w:rPr>
           <w:b/>
           <w:bCs/>
+          <w:lang w:val="en-US"/>
         </w:rPr>
         <w:t xml:space="preserve"> </w:t>
       </w:r>
@@ -1955,6 +1944,7 @@
         <w:rPr>
           <w:b/>
           <w:bCs/>
+          <w:lang w:val="en-US"/>
         </w:rPr>
         <w:t xml:space="preserve"> </w:t>
       </w:r>
@@ -2080,20 +2070,454 @@
         <w:rPr>
           <w:lang w:val="en-US"/>
         </w:rPr>
-        <w:t xml:space="preserve"> </w:t>
-      </w:r>
-      <w:proofErr w:type="spellStart"/>
-      <w:r>
-        <w:rPr>
-          <w:lang w:val="en-US"/>
-        </w:rPr>
-        <w:t>TotalAmount</w:t>
-      </w:r>
-      <w:proofErr w:type="spellEnd"/>
-      <w:r>
-        <w:rPr>
-          <w:lang w:val="en-US"/>
-        </w:rPr>
+        <w:t xml:space="preserve"> Status: </w:t>
+      </w:r>
+      <w:proofErr w:type="gramStart"/>
+      <w:r>
+        <w:rPr>
+          <w:lang w:val="en-US"/>
+        </w:rPr>
+        <w:t>VARCHAR(</w:t>
+      </w:r>
+      <w:proofErr w:type="gramEnd"/>
+      <w:r>
+        <w:rPr>
+          <w:lang w:val="en-US"/>
+        </w:rPr>
+        <w:t xml:space="preserve">50), NOT NULL, DEFAULT 'New'  </w:t>
+      </w:r>
+    </w:p>
+    <w:p>
+      <w:pPr>
+        <w:spacing w:after="0"/>
+        <w:ind w:left="706" w:firstLine="709"/>
+        <w:jc w:val="both"/>
+        <w:rPr>
+          <w:b/>
+          <w:bCs/>
+          <w:lang w:val="en-US"/>
+        </w:rPr>
+      </w:pPr>
+      <w:r>
+        <w:rPr>
+          <w:b/>
+          <w:bCs/>
+          <w:lang w:val="en-US"/>
+        </w:rPr>
+        <w:t>◦</w:t>
+      </w:r>
+      <w:r>
+        <w:rPr>
+          <w:b/>
+          <w:bCs/>
+          <w:lang w:val="en-US"/>
+        </w:rPr>
+        <w:t xml:space="preserve"> Constraints:</w:t>
+      </w:r>
+    </w:p>
+    <w:p>
+      <w:pPr>
+        <w:spacing w:after="0"/>
+        <w:ind w:left="1415" w:firstLine="709"/>
+        <w:jc w:val="both"/>
+        <w:rPr>
+          <w:lang w:val="en-US"/>
+        </w:rPr>
+      </w:pPr>
+      <w:r>
+        <w:rPr>
+          <w:lang w:val="en-US"/>
+        </w:rPr>
+        <w:t>▪</w:t>
+      </w:r>
+      <w:r>
+        <w:rPr>
+          <w:lang w:val="en-US"/>
+        </w:rPr>
+        <w:t xml:space="preserve"> </w:t>
+      </w:r>
+      <w:proofErr w:type="spellStart"/>
+      <w:r>
+        <w:rPr>
+          <w:lang w:val="en-US"/>
+        </w:rPr>
+        <w:t>PK_Orders</w:t>
+      </w:r>
+      <w:proofErr w:type="spellEnd"/>
+      <w:r>
+        <w:rPr>
+          <w:lang w:val="en-US"/>
+        </w:rPr>
+        <w:t xml:space="preserve">: PRIMARY KEY (OrderID)  </w:t>
+      </w:r>
+    </w:p>
+    <w:p>
+      <w:pPr>
+        <w:spacing w:after="0"/>
+        <w:ind w:left="1415" w:firstLine="709"/>
+        <w:jc w:val="both"/>
+        <w:rPr>
+          <w:lang w:val="en-US"/>
+        </w:rPr>
+      </w:pPr>
+      <w:r>
+        <w:rPr>
+          <w:lang w:val="en-US"/>
+        </w:rPr>
+        <w:t>▪</w:t>
+      </w:r>
+      <w:r>
+        <w:rPr>
+          <w:lang w:val="en-US"/>
+        </w:rPr>
+        <w:t xml:space="preserve"> </w:t>
+      </w:r>
+      <w:proofErr w:type="spellStart"/>
+      <w:r>
+        <w:rPr>
+          <w:lang w:val="en-US"/>
+        </w:rPr>
+        <w:t>FK_Orders_Customers</w:t>
+      </w:r>
+      <w:proofErr w:type="spellEnd"/>
+      <w:r>
+        <w:rPr>
+          <w:lang w:val="en-US"/>
+        </w:rPr>
+        <w:t>: FOREIGN KEY (</w:t>
+      </w:r>
+      <w:proofErr w:type="spellStart"/>
+      <w:r>
+        <w:rPr>
+          <w:lang w:val="en-US"/>
+        </w:rPr>
+        <w:t>CustomerID</w:t>
+      </w:r>
+      <w:proofErr w:type="spellEnd"/>
+      <w:r>
+        <w:rPr>
+          <w:lang w:val="en-US"/>
+        </w:rPr>
+        <w:t xml:space="preserve">) REFERENCES </w:t>
+      </w:r>
+      <w:proofErr w:type="gramStart"/>
+      <w:r>
+        <w:rPr>
+          <w:lang w:val="en-US"/>
+        </w:rPr>
+        <w:t>Customers(</w:t>
+      </w:r>
+      <w:proofErr w:type="spellStart"/>
+      <w:proofErr w:type="gramEnd"/>
+      <w:r>
+        <w:rPr>
+          <w:lang w:val="en-US"/>
+        </w:rPr>
+        <w:t>CustomerID</w:t>
+      </w:r>
+      <w:proofErr w:type="spellEnd"/>
+      <w:r>
+        <w:rPr>
+          <w:lang w:val="en-US"/>
+        </w:rPr>
+        <w:t xml:space="preserve">)  </w:t>
+      </w:r>
+    </w:p>
+    <w:p>
+      <w:pPr>
+        <w:spacing w:after="0"/>
+        <w:ind w:left="1415" w:firstLine="709"/>
+        <w:jc w:val="both"/>
+        <w:rPr>
+          <w:lang w:val="en-US"/>
+        </w:rPr>
+      </w:pPr>
+      <w:r>
+        <w:rPr>
+          <w:lang w:val="en-US"/>
+        </w:rPr>
+        <w:t>▪</w:t>
+      </w:r>
+      <w:r>
+        <w:rPr>
+          <w:lang w:val="en-US"/>
+        </w:rPr>
+        <w:t xml:space="preserve"> </w:t>
+      </w:r>
+      <w:proofErr w:type="spellStart"/>
+      <w:r>
+        <w:rPr>
+          <w:lang w:val="en-US"/>
+        </w:rPr>
+        <w:t>CHK_</w:t>
+      </w:r>
+      <w:r>
+        <w:rPr>
+          <w:lang w:val="en-US"/>
+        </w:rPr>
+        <w:t>Status</w:t>
+      </w:r>
+      <w:proofErr w:type="spellEnd"/>
+      <w:r>
+        <w:rPr>
+          <w:lang w:val="en-US"/>
+        </w:rPr>
+        <w:t>: CHECK</w:t>
+      </w:r>
+      <w:r>
+        <w:rPr>
+          <w:lang w:val="en-US"/>
+        </w:rPr>
+        <w:t xml:space="preserve"> </w:t>
+      </w:r>
+      <w:r>
+        <w:rPr>
+          <w:lang w:val="en-US"/>
+        </w:rPr>
+        <w:t>(Status IN ('New', 'Paid', 'Shipped', 'Cancelled'))</w:t>
+      </w:r>
+      <w:r>
+        <w:rPr>
+          <w:lang w:val="en-US"/>
+        </w:rPr>
+        <w:t xml:space="preserve">  </w:t>
+      </w:r>
+    </w:p>
+    <w:p>
+      <w:pPr>
+        <w:spacing w:after="0"/>
+        <w:ind w:firstLine="709"/>
+        <w:jc w:val="both"/>
+        <w:rPr>
+          <w:b/>
+          <w:bCs/>
+          <w:lang w:val="en-US"/>
+        </w:rPr>
+      </w:pPr>
+      <w:r>
+        <w:rPr>
+          <w:b/>
+          <w:bCs/>
+          <w:lang w:val="en-US"/>
+        </w:rPr>
+        <w:t xml:space="preserve">5. Table Name: </w:t>
+      </w:r>
+      <w:proofErr w:type="spellStart"/>
+      <w:r>
+        <w:rPr>
+          <w:b/>
+          <w:bCs/>
+          <w:lang w:val="en-US"/>
+        </w:rPr>
+        <w:t>OrderItems</w:t>
+      </w:r>
+      <w:proofErr w:type="spellEnd"/>
+    </w:p>
+    <w:p>
+      <w:pPr>
+        <w:spacing w:after="0"/>
+        <w:ind w:left="708" w:firstLine="709"/>
+        <w:jc w:val="both"/>
+      </w:pPr>
+      <w:r>
+        <w:t>◦</w:t>
+      </w:r>
+      <w:r>
+        <w:t xml:space="preserve"> </w:t>
+      </w:r>
+      <w:r>
+        <w:rPr>
+          <w:b/>
+          <w:bCs/>
+          <w:lang w:val="en-US"/>
+        </w:rPr>
+        <w:t>Description</w:t>
+      </w:r>
+      <w:r>
+        <w:rPr>
+          <w:b/>
+          <w:bCs/>
+        </w:rPr>
+        <w:t>:</w:t>
+      </w:r>
+      <w:r>
+        <w:t xml:space="preserve"> Таблица для реализации связи многие-ко-многим. Записывает информацию о конкретных товарах в заказах.</w:t>
+      </w:r>
+      <w:r>
+        <w:rPr>
+          <w:lang w:val="en-US"/>
+        </w:rPr>
+        <w:t> </w:t>
+      </w:r>
+      <w:r>
+        <w:t xml:space="preserve"> </w:t>
+      </w:r>
+    </w:p>
+    <w:p>
+      <w:pPr>
+        <w:spacing w:after="0"/>
+        <w:ind w:left="707" w:firstLine="709"/>
+        <w:jc w:val="both"/>
+        <w:rPr>
+          <w:b/>
+          <w:bCs/>
+          <w:lang w:val="en-US"/>
+        </w:rPr>
+      </w:pPr>
+      <w:r>
+        <w:rPr>
+          <w:b/>
+          <w:bCs/>
+          <w:lang w:val="en-US"/>
+        </w:rPr>
+        <w:t>◦</w:t>
+      </w:r>
+      <w:r>
+        <w:rPr>
+          <w:b/>
+          <w:bCs/>
+          <w:lang w:val="en-US"/>
+        </w:rPr>
+        <w:t xml:space="preserve"> Attributes:</w:t>
+      </w:r>
+    </w:p>
+    <w:p>
+      <w:pPr>
+        <w:spacing w:after="0"/>
+        <w:ind w:left="1415" w:firstLine="709"/>
+        <w:jc w:val="both"/>
+        <w:rPr>
+          <w:lang w:val="en-US"/>
+        </w:rPr>
+      </w:pPr>
+      <w:r>
+        <w:rPr>
+          <w:lang w:val="en-US"/>
+        </w:rPr>
+        <w:t>▪</w:t>
+      </w:r>
+      <w:r>
+        <w:rPr>
+          <w:lang w:val="en-US"/>
+        </w:rPr>
+        <w:t xml:space="preserve"> </w:t>
+      </w:r>
+      <w:proofErr w:type="spellStart"/>
+      <w:r>
+        <w:rPr>
+          <w:lang w:val="en-US"/>
+        </w:rPr>
+        <w:t>OrderItemID</w:t>
+      </w:r>
+      <w:proofErr w:type="spellEnd"/>
+      <w:r>
+        <w:rPr>
+          <w:lang w:val="en-US"/>
+        </w:rPr>
+        <w:t xml:space="preserve">: INTEGER, PK, NOT NULL, UNIQUE  </w:t>
+      </w:r>
+    </w:p>
+    <w:p>
+      <w:pPr>
+        <w:spacing w:after="0"/>
+        <w:ind w:left="1415" w:firstLine="709"/>
+        <w:jc w:val="both"/>
+        <w:rPr>
+          <w:lang w:val="en-US"/>
+        </w:rPr>
+      </w:pPr>
+      <w:r>
+        <w:rPr>
+          <w:lang w:val="en-US"/>
+        </w:rPr>
+        <w:t>▪</w:t>
+      </w:r>
+      <w:r>
+        <w:rPr>
+          <w:lang w:val="en-US"/>
+        </w:rPr>
+        <w:t xml:space="preserve"> OrderID: INTEGER, FK (REFERENCES Orders), NOT NULL  </w:t>
+      </w:r>
+    </w:p>
+    <w:p>
+      <w:pPr>
+        <w:spacing w:after="0"/>
+        <w:ind w:left="1415" w:firstLine="709"/>
+        <w:jc w:val="both"/>
+        <w:rPr>
+          <w:lang w:val="en-US"/>
+        </w:rPr>
+      </w:pPr>
+      <w:r>
+        <w:rPr>
+          <w:lang w:val="en-US"/>
+        </w:rPr>
+        <w:t>▪</w:t>
+      </w:r>
+      <w:r>
+        <w:rPr>
+          <w:lang w:val="en-US"/>
+        </w:rPr>
+        <w:t xml:space="preserve"> </w:t>
+      </w:r>
+      <w:proofErr w:type="spellStart"/>
+      <w:r>
+        <w:rPr>
+          <w:lang w:val="en-US"/>
+        </w:rPr>
+        <w:t>ProductID</w:t>
+      </w:r>
+      <w:proofErr w:type="spellEnd"/>
+      <w:r>
+        <w:rPr>
+          <w:lang w:val="en-US"/>
+        </w:rPr>
+        <w:t xml:space="preserve">: INTEGER, FK (REFERENCES Products), NOT NULL  </w:t>
+      </w:r>
+    </w:p>
+    <w:p>
+      <w:pPr>
+        <w:spacing w:after="0"/>
+        <w:ind w:left="1415" w:firstLine="709"/>
+        <w:jc w:val="both"/>
+        <w:rPr>
+          <w:lang w:val="en-US"/>
+        </w:rPr>
+      </w:pPr>
+      <w:r>
+        <w:rPr>
+          <w:lang w:val="en-US"/>
+        </w:rPr>
+        <w:t>▪</w:t>
+      </w:r>
+      <w:r>
+        <w:rPr>
+          <w:lang w:val="en-US"/>
+        </w:rPr>
+        <w:t xml:space="preserve"> Quantity: INTEGER, NOT NULL  </w:t>
+      </w:r>
+    </w:p>
+    <w:p>
+      <w:pPr>
+        <w:spacing w:after="0"/>
+        <w:ind w:left="1415" w:firstLine="709"/>
+        <w:jc w:val="both"/>
+      </w:pPr>
+      <w:r>
+        <w:t>▪</w:t>
+      </w:r>
+      <w:r>
+        <w:t xml:space="preserve"> </w:t>
+      </w:r>
+      <w:proofErr w:type="spellStart"/>
+      <w:r>
+        <w:rPr>
+          <w:lang w:val="en-US"/>
+        </w:rPr>
+        <w:t>UnitPrice</w:t>
+      </w:r>
+      <w:proofErr w:type="spellEnd"/>
+      <w:r>
         <w:t xml:space="preserve">: </w:t>
       </w:r>
       <w:proofErr w:type="gramStart"/>
@@ -2101,14 +2525,60 @@
         <w:rPr>
           <w:lang w:val="en-US"/>
         </w:rPr>
-        <w:t>DECIMAL(</w:t>
+        <w:t>DECIMAL</w:t>
+      </w:r>
+      <w:r>
+        <w:t>(</w:t>
       </w:r>
       <w:proofErr w:type="gramEnd"/>
       <w:r>
-        <w:rPr>
-          <w:lang w:val="en-US"/>
-        </w:rPr>
-        <w:t xml:space="preserve">10, 2), NOT NULL, DEFAULT 0.00  </w:t>
+        <w:t xml:space="preserve">10, 2), </w:t>
+      </w:r>
+      <w:r>
+        <w:rPr>
+          <w:lang w:val="en-US"/>
+        </w:rPr>
+        <w:t>NOT</w:t>
+      </w:r>
+      <w:r>
+        <w:t xml:space="preserve"> </w:t>
+      </w:r>
+      <w:r>
+        <w:rPr>
+          <w:lang w:val="en-US"/>
+        </w:rPr>
+        <w:t>NULL </w:t>
+      </w:r>
+      <w:r>
+        <w:t>(Цена товара на момент оформления заказа)</w:t>
+      </w:r>
+    </w:p>
+    <w:p>
+      <w:pPr>
+        <w:spacing w:after="0"/>
+        <w:ind w:left="706" w:firstLine="709"/>
+        <w:jc w:val="both"/>
+        <w:rPr>
+          <w:b/>
+          <w:bCs/>
+          <w:lang w:val="en-US"/>
+        </w:rPr>
+      </w:pPr>
+      <w:r>
+        <w:rPr>
+          <w:b/>
+          <w:bCs/>
+          <w:lang w:val="en-US"/>
+        </w:rPr>
+        <w:t>◦</w:t>
+      </w:r>
+      <w:r>
+        <w:rPr>
+          <w:b/>
+          <w:bCs/>
+          <w:lang w:val="en-US"/>
+        </w:rPr>
+        <w:t xml:space="preserve"> Constraints:</w:t>
       </w:r>
     </w:p>
     <w:p>
@@ -2124,677 +2594,85 @@
         <w:rPr>
           <w:lang w:val="en-US"/>
         </w:rPr>
+        <w:t xml:space="preserve">▪ </w:t>
+      </w:r>
+      <w:proofErr w:type="spellStart"/>
+      <w:r>
+        <w:rPr>
+          <w:lang w:val="en-US"/>
+        </w:rPr>
+        <w:t>PK_OrderItems</w:t>
+      </w:r>
+      <w:proofErr w:type="spellEnd"/>
+      <w:r>
+        <w:rPr>
+          <w:lang w:val="en-US"/>
+        </w:rPr>
+        <w:t>: PRIMARY KEY (</w:t>
+      </w:r>
+      <w:proofErr w:type="spellStart"/>
+      <w:r>
+        <w:rPr>
+          <w:lang w:val="en-US"/>
+        </w:rPr>
+        <w:t>OrderItemID</w:t>
+      </w:r>
+      <w:proofErr w:type="spellEnd"/>
+      <w:r>
+        <w:rPr>
+          <w:lang w:val="en-US"/>
+        </w:rPr>
+        <w:t xml:space="preserve">)  </w:t>
+      </w:r>
+    </w:p>
+    <w:p>
+      <w:pPr>
+        <w:spacing w:after="0"/>
+        <w:ind w:left="1415" w:firstLine="709"/>
+        <w:jc w:val="both"/>
+        <w:rPr>
+          <w:lang w:val="en-US"/>
+        </w:rPr>
+      </w:pPr>
+      <w:r>
+        <w:rPr>
+          <w:lang w:val="en-US"/>
+        </w:rPr>
         <w:t>▪</w:t>
       </w:r>
       <w:r>
         <w:rPr>
           <w:lang w:val="en-US"/>
         </w:rPr>
-        <w:t xml:space="preserve"> Status: </w:t>
+        <w:t xml:space="preserve"> </w:t>
+      </w:r>
+      <w:proofErr w:type="spellStart"/>
+      <w:r>
+        <w:rPr>
+          <w:lang w:val="en-US"/>
+        </w:rPr>
+        <w:t>FK_OrderItems_Orders</w:t>
+      </w:r>
+      <w:proofErr w:type="spellEnd"/>
+      <w:r>
+        <w:rPr>
+          <w:lang w:val="en-US"/>
+        </w:rPr>
+        <w:t xml:space="preserve">: FOREIGN KEY (OrderID) REFERENCES </w:t>
       </w:r>
       <w:proofErr w:type="gramStart"/>
       <w:r>
         <w:rPr>
           <w:lang w:val="en-US"/>
         </w:rPr>
-        <w:t>VARCHAR(</w:t>
+        <w:t>Orders(</w:t>
       </w:r>
       <w:proofErr w:type="gramEnd"/>
       <w:r>
         <w:rPr>
           <w:lang w:val="en-US"/>
         </w:rPr>
-        <w:t xml:space="preserve">50), NOT NULL, DEFAULT 'New'  </w:t>
-      </w:r>
-    </w:p>
-    <w:p>
-      <w:pPr>
-        <w:spacing w:after="0"/>
-        <w:ind w:left="706" w:firstLine="709"/>
-        <w:jc w:val="both"/>
-        <w:rPr>
-          <w:b/>
-          <w:bCs/>
-          <w:lang w:val="en-US"/>
-        </w:rPr>
-      </w:pPr>
-      <w:r>
-        <w:rPr>
-          <w:b/>
-          <w:bCs/>
-          <w:lang w:val="en-US"/>
-        </w:rPr>
-        <w:t>◦</w:t>
-      </w:r>
-      <w:r>
-        <w:rPr>
-          <w:b/>
-          <w:bCs/>
-          <w:lang w:val="en-US"/>
-        </w:rPr>
-        <w:t xml:space="preserve"> Constraints:</w:t>
-      </w:r>
-    </w:p>
-    <w:p>
-      <w:pPr>
-        <w:spacing w:after="0"/>
-        <w:ind w:left="1415" w:firstLine="709"/>
-        <w:jc w:val="both"/>
-        <w:rPr>
-          <w:lang w:val="en-US"/>
-        </w:rPr>
-      </w:pPr>
-      <w:r>
-        <w:rPr>
-          <w:lang w:val="en-US"/>
-        </w:rPr>
-        <w:t>▪</w:t>
-      </w:r>
-      <w:r>
-        <w:rPr>
-          <w:lang w:val="en-US"/>
-        </w:rPr>
-        <w:t xml:space="preserve"> </w:t>
-      </w:r>
-      <w:proofErr w:type="spellStart"/>
-      <w:r>
-        <w:rPr>
-          <w:lang w:val="en-US"/>
-        </w:rPr>
-        <w:t>PK_Orders</w:t>
-      </w:r>
-      <w:proofErr w:type="spellEnd"/>
-      <w:r>
-        <w:rPr>
-          <w:lang w:val="en-US"/>
-        </w:rPr>
-        <w:t xml:space="preserve">: PRIMARY KEY (OrderID)  </w:t>
-      </w:r>
-    </w:p>
-    <w:p>
-      <w:pPr>
-        <w:spacing w:after="0"/>
-        <w:ind w:left="1415" w:firstLine="709"/>
-        <w:jc w:val="both"/>
-        <w:rPr>
-          <w:lang w:val="en-US"/>
-        </w:rPr>
-      </w:pPr>
-      <w:r>
-        <w:rPr>
-          <w:lang w:val="en-US"/>
-        </w:rPr>
-        <w:t>▪</w:t>
-      </w:r>
-      <w:r>
-        <w:rPr>
-          <w:lang w:val="en-US"/>
-        </w:rPr>
-        <w:t xml:space="preserve"> </w:t>
-      </w:r>
-      <w:proofErr w:type="spellStart"/>
-      <w:r>
-        <w:rPr>
-          <w:lang w:val="en-US"/>
-        </w:rPr>
-        <w:t>FK_Orders_Customers</w:t>
-      </w:r>
-      <w:proofErr w:type="spellEnd"/>
-      <w:r>
-        <w:rPr>
-          <w:lang w:val="en-US"/>
-        </w:rPr>
-        <w:t>: FOREIGN KEY (</w:t>
-      </w:r>
-      <w:proofErr w:type="spellStart"/>
-      <w:r>
-        <w:rPr>
-          <w:lang w:val="en-US"/>
-        </w:rPr>
-        <w:t>CustomerID</w:t>
-      </w:r>
-      <w:proofErr w:type="spellEnd"/>
-      <w:r>
-        <w:rPr>
-          <w:lang w:val="en-US"/>
-        </w:rPr>
-        <w:t xml:space="preserve">) REFERENCES </w:t>
-      </w:r>
-      <w:proofErr w:type="gramStart"/>
-      <w:r>
-        <w:rPr>
-          <w:lang w:val="en-US"/>
-        </w:rPr>
-        <w:t>Customers(</w:t>
-      </w:r>
-      <w:proofErr w:type="spellStart"/>
-      <w:proofErr w:type="gramEnd"/>
-      <w:r>
-        <w:rPr>
-          <w:lang w:val="en-US"/>
-        </w:rPr>
-        <w:t>CustomerID</w:t>
-      </w:r>
-      <w:proofErr w:type="spellEnd"/>
-      <w:r>
-        <w:rPr>
-          <w:lang w:val="en-US"/>
-        </w:rPr>
-        <w:t xml:space="preserve">)  </w:t>
-      </w:r>
-    </w:p>
-    <w:p>
-      <w:pPr>
-        <w:spacing w:after="0"/>
-        <w:ind w:left="1415" w:firstLine="709"/>
-        <w:jc w:val="both"/>
-        <w:rPr>
-          <w:lang w:val="en-US"/>
-        </w:rPr>
-      </w:pPr>
-      <w:r>
-        <w:rPr>
-          <w:lang w:val="en-US"/>
-        </w:rPr>
-        <w:t>▪</w:t>
-      </w:r>
-      <w:r>
-        <w:rPr>
-          <w:lang w:val="en-US"/>
-        </w:rPr>
-        <w:t xml:space="preserve"> </w:t>
-      </w:r>
-      <w:proofErr w:type="spellStart"/>
-      <w:r>
-        <w:rPr>
-          <w:lang w:val="en-US"/>
-        </w:rPr>
-        <w:t>CHK_TotalAmount</w:t>
-      </w:r>
-      <w:proofErr w:type="spellEnd"/>
-      <w:r>
-        <w:rPr>
-          <w:lang w:val="en-US"/>
-        </w:rPr>
-        <w:t>: CHECK (</w:t>
-      </w:r>
-      <w:proofErr w:type="spellStart"/>
-      <w:r>
-        <w:rPr>
-          <w:lang w:val="en-US"/>
-        </w:rPr>
-        <w:t>TotalAmount</w:t>
-      </w:r>
-      <w:proofErr w:type="spellEnd"/>
-      <w:r>
-        <w:rPr>
-          <w:lang w:val="en-US"/>
-        </w:rPr>
-        <w:t xml:space="preserve"> &gt;= 0)  </w:t>
-      </w:r>
-    </w:p>
-    <w:p>
-      <w:pPr>
-        <w:spacing w:after="0"/>
-        <w:ind w:firstLine="709"/>
-        <w:jc w:val="both"/>
-        <w:rPr>
-          <w:b/>
-          <w:bCs/>
-          <w:lang w:val="en-US"/>
-        </w:rPr>
-      </w:pPr>
-      <w:r>
-        <w:rPr>
-          <w:b/>
-          <w:bCs/>
-          <w:lang w:val="en-US"/>
-        </w:rPr>
-        <w:t xml:space="preserve">5. Table Name: </w:t>
-      </w:r>
-      <w:proofErr w:type="spellStart"/>
-      <w:r>
-        <w:rPr>
-          <w:b/>
-          <w:bCs/>
-          <w:lang w:val="en-US"/>
-        </w:rPr>
-        <w:t>OrderItems</w:t>
-      </w:r>
-      <w:proofErr w:type="spellEnd"/>
-    </w:p>
-    <w:p>
-      <w:pPr>
-        <w:spacing w:after="0"/>
-        <w:ind w:left="708" w:firstLine="709"/>
-        <w:jc w:val="both"/>
-      </w:pPr>
-      <w:r>
-        <w:t>◦</w:t>
-      </w:r>
-      <w:r>
-        <w:t xml:space="preserve"> </w:t>
-      </w:r>
-      <w:r>
-        <w:rPr>
-          <w:b/>
-          <w:bCs/>
-          <w:lang w:val="en-US"/>
-        </w:rPr>
-        <w:t>Description</w:t>
-      </w:r>
-      <w:r>
-        <w:rPr>
-          <w:b/>
-          <w:bCs/>
-        </w:rPr>
-        <w:t>:</w:t>
-      </w:r>
-      <w:r>
-        <w:t xml:space="preserve"> Таблица для реализации связи многие-ко-многим. Записывает информацию о конкретных товарах в заказах.</w:t>
-      </w:r>
-      <w:r>
-        <w:rPr>
-          <w:lang w:val="en-US"/>
-        </w:rPr>
-        <w:t> </w:t>
-      </w:r>
-      <w:r>
-        <w:t xml:space="preserve"> </w:t>
-      </w:r>
-    </w:p>
-    <w:p>
-      <w:pPr>
-        <w:spacing w:after="0"/>
-        <w:ind w:left="707" w:firstLine="709"/>
-        <w:jc w:val="both"/>
-        <w:rPr>
-          <w:b/>
-          <w:bCs/>
-          <w:lang w:val="en-US"/>
-        </w:rPr>
-      </w:pPr>
-      <w:r>
-        <w:rPr>
-          <w:b/>
-          <w:bCs/>
-          <w:lang w:val="en-US"/>
-        </w:rPr>
-        <w:t>◦</w:t>
-      </w:r>
-      <w:r>
-        <w:rPr>
-          <w:b/>
-          <w:bCs/>
-          <w:lang w:val="en-US"/>
-        </w:rPr>
-        <w:t xml:space="preserve"> Attributes:</w:t>
-      </w:r>
-    </w:p>
-    <w:p>
-      <w:pPr>
-        <w:spacing w:after="0"/>
-        <w:ind w:left="1415" w:firstLine="709"/>
-        <w:jc w:val="both"/>
-        <w:rPr>
-          <w:lang w:val="en-US"/>
-        </w:rPr>
-      </w:pPr>
-      <w:r>
-        <w:rPr>
-          <w:lang w:val="en-US"/>
-        </w:rPr>
-        <w:t>▪</w:t>
-      </w:r>
-      <w:r>
-        <w:rPr>
-          <w:lang w:val="en-US"/>
-        </w:rPr>
-        <w:t xml:space="preserve"> </w:t>
-      </w:r>
-      <w:proofErr w:type="spellStart"/>
-      <w:r>
-        <w:rPr>
-          <w:lang w:val="en-US"/>
-        </w:rPr>
-        <w:t>OrderItemID</w:t>
-      </w:r>
-      <w:proofErr w:type="spellEnd"/>
-      <w:r>
-        <w:rPr>
-          <w:lang w:val="en-US"/>
-        </w:rPr>
-        <w:t xml:space="preserve">: INTEGER, PK, NOT NULL, UNIQUE  </w:t>
-      </w:r>
-    </w:p>
-    <w:p>
-      <w:pPr>
-        <w:spacing w:after="0"/>
-        <w:ind w:left="1415" w:firstLine="709"/>
-        <w:jc w:val="both"/>
-        <w:rPr>
-          <w:lang w:val="en-US"/>
-        </w:rPr>
-      </w:pPr>
-      <w:r>
-        <w:rPr>
-          <w:lang w:val="en-US"/>
-        </w:rPr>
-        <w:t>▪</w:t>
-      </w:r>
-      <w:r>
-        <w:rPr>
-          <w:lang w:val="en-US"/>
-        </w:rPr>
-        <w:t xml:space="preserve"> OrderID: INTEGER, FK (REFERENCES Orders), NOT NULL  </w:t>
-      </w:r>
-    </w:p>
-    <w:p>
-      <w:pPr>
-        <w:spacing w:after="0"/>
-        <w:ind w:left="1415" w:firstLine="709"/>
-        <w:jc w:val="both"/>
-        <w:rPr>
-          <w:lang w:val="en-US"/>
-        </w:rPr>
-      </w:pPr>
-      <w:r>
-        <w:rPr>
-          <w:lang w:val="en-US"/>
-        </w:rPr>
-        <w:t>▪</w:t>
-      </w:r>
-      <w:r>
-        <w:rPr>
-          <w:lang w:val="en-US"/>
-        </w:rPr>
-        <w:t xml:space="preserve"> </w:t>
-      </w:r>
-      <w:proofErr w:type="spellStart"/>
-      <w:r>
-        <w:rPr>
-          <w:lang w:val="en-US"/>
-        </w:rPr>
-        <w:t>ProductID</w:t>
-      </w:r>
-      <w:proofErr w:type="spellEnd"/>
-      <w:r>
-        <w:rPr>
-          <w:lang w:val="en-US"/>
-        </w:rPr>
-        <w:t xml:space="preserve">: INTEGER, FK (REFERENCES Products), NOT NULL  </w:t>
-      </w:r>
-    </w:p>
-    <w:p>
-      <w:pPr>
-        <w:spacing w:after="0"/>
-        <w:ind w:left="1415" w:firstLine="709"/>
-        <w:jc w:val="both"/>
-        <w:rPr>
-          <w:lang w:val="en-US"/>
-        </w:rPr>
-      </w:pPr>
-      <w:r>
-        <w:rPr>
-          <w:lang w:val="en-US"/>
-        </w:rPr>
-        <w:t>▪</w:t>
-      </w:r>
-      <w:r>
-        <w:rPr>
-          <w:lang w:val="en-US"/>
-        </w:rPr>
-        <w:t xml:space="preserve"> Quantity: INTEGER, NOT NULL  </w:t>
-      </w:r>
-    </w:p>
-    <w:p>
-      <w:pPr>
-        <w:spacing w:after="0"/>
-        <w:ind w:left="1415" w:firstLine="709"/>
-        <w:jc w:val="both"/>
-        <w:rPr>
-          <w:lang w:val="en-US"/>
-        </w:rPr>
-      </w:pPr>
-      <w:r>
-        <w:rPr>
-          <w:lang w:val="en-US"/>
-        </w:rPr>
-        <w:t>▪</w:t>
-      </w:r>
-      <w:r>
-        <w:rPr>
-          <w:lang w:val="en-US"/>
-        </w:rPr>
-        <w:t xml:space="preserve"> </w:t>
-      </w:r>
-      <w:proofErr w:type="spellStart"/>
-      <w:r>
-        <w:rPr>
-          <w:lang w:val="en-US"/>
-        </w:rPr>
-        <w:t>UnitPrice</w:t>
-      </w:r>
-      <w:proofErr w:type="spellEnd"/>
-      <w:r>
-        <w:rPr>
-          <w:lang w:val="en-US"/>
-        </w:rPr>
-        <w:t xml:space="preserve">: </w:t>
-      </w:r>
-      <w:proofErr w:type="gramStart"/>
-      <w:r>
-        <w:rPr>
-          <w:lang w:val="en-US"/>
-        </w:rPr>
-        <w:t>DECIMAL(</w:t>
-      </w:r>
-      <w:proofErr w:type="gramEnd"/>
-      <w:r>
-        <w:rPr>
-          <w:lang w:val="en-US"/>
-        </w:rPr>
-        <w:t xml:space="preserve">10, 2), NOT NULL  </w:t>
-      </w:r>
-    </w:p>
-    <w:p>
-      <w:pPr>
-        <w:spacing w:after="0"/>
-        <w:ind w:left="706" w:firstLine="709"/>
-        <w:jc w:val="both"/>
-        <w:rPr>
-          <w:b/>
-          <w:bCs/>
-          <w:lang w:val="en-US"/>
-        </w:rPr>
-      </w:pPr>
-      <w:r>
-        <w:rPr>
-          <w:b/>
-          <w:bCs/>
-          <w:lang w:val="en-US"/>
-        </w:rPr>
-        <w:t>◦</w:t>
-      </w:r>
-      <w:r>
-        <w:rPr>
-          <w:b/>
-          <w:bCs/>
-          <w:lang w:val="en-US"/>
-        </w:rPr>
-        <w:t xml:space="preserve"> Constraints:</w:t>
-      </w:r>
-    </w:p>
-    <w:p>
-      <w:pPr>
-        <w:spacing w:after="0"/>
-        <w:ind w:left="1415" w:firstLine="709"/>
-        <w:jc w:val="both"/>
-        <w:rPr>
-          <w:lang w:val="en-US"/>
-        </w:rPr>
-      </w:pPr>
-      <w:r>
-        <w:rPr>
-          <w:lang w:val="en-US"/>
-        </w:rPr>
-        <w:t>▪</w:t>
-      </w:r>
-      <w:r>
-        <w:rPr>
-          <w:lang w:val="en-US"/>
-        </w:rPr>
-        <w:t xml:space="preserve"> </w:t>
-      </w:r>
-      <w:proofErr w:type="spellStart"/>
-      <w:r>
-        <w:rPr>
-          <w:lang w:val="en-US"/>
-        </w:rPr>
-        <w:t>PK_OrderItems</w:t>
-      </w:r>
-      <w:proofErr w:type="spellEnd"/>
-      <w:r>
-        <w:rPr>
-          <w:lang w:val="en-US"/>
-        </w:rPr>
-        <w:t>: PRIMARY KEY (</w:t>
-      </w:r>
-      <w:proofErr w:type="spellStart"/>
-      <w:r>
-        <w:rPr>
-          <w:lang w:val="en-US"/>
-        </w:rPr>
-        <w:t>OrderItemID</w:t>
-      </w:r>
-      <w:proofErr w:type="spellEnd"/>
-      <w:r>
-        <w:rPr>
-          <w:lang w:val="en-US"/>
-        </w:rPr>
-        <w:t xml:space="preserve">)  </w:t>
-      </w:r>
-    </w:p>
-    <w:p>
-      <w:pPr>
-        <w:spacing w:after="0"/>
-        <w:ind w:left="1415" w:firstLine="709"/>
-        <w:jc w:val="both"/>
-        <w:rPr>
-          <w:lang w:val="en-US"/>
-        </w:rPr>
-      </w:pPr>
-      <w:r>
-        <w:rPr>
-          <w:lang w:val="en-US"/>
-        </w:rPr>
-        <w:t>▪</w:t>
-      </w:r>
-      <w:r>
-        <w:rPr>
-          <w:lang w:val="en-US"/>
-        </w:rPr>
-        <w:t xml:space="preserve"> </w:t>
-      </w:r>
-      <w:proofErr w:type="spellStart"/>
-      <w:r>
-        <w:rPr>
-          <w:lang w:val="en-US"/>
-        </w:rPr>
-        <w:t>FK_OrderItems_Orders</w:t>
-      </w:r>
-      <w:proofErr w:type="spellEnd"/>
-      <w:r>
-        <w:rPr>
-          <w:lang w:val="en-US"/>
-        </w:rPr>
-        <w:t xml:space="preserve">: FOREIGN KEY (OrderID) REFERENCES </w:t>
-      </w:r>
-      <w:proofErr w:type="gramStart"/>
-      <w:r>
-        <w:rPr>
-          <w:lang w:val="en-US"/>
-        </w:rPr>
-        <w:t>Orders(</w:t>
-      </w:r>
-      <w:proofErr w:type="gramEnd"/>
-      <w:r>
-        <w:rPr>
-          <w:lang w:val="en-US"/>
-        </w:rPr>
         <w:t xml:space="preserve">OrderID)  </w:t>
-      </w:r>
-    </w:p>
-    <w:p>
-      <w:pPr>
-        <w:spacing w:after="0"/>
-        <w:ind w:left="1415" w:firstLine="709"/>
-        <w:jc w:val="both"/>
-        <w:rPr>
-          <w:lang w:val="en-US"/>
-        </w:rPr>
-      </w:pPr>
-      <w:r>
-        <w:rPr>
-          <w:lang w:val="en-US"/>
-        </w:rPr>
-        <w:t>▪</w:t>
-      </w:r>
-      <w:r>
-        <w:rPr>
-          <w:lang w:val="en-US"/>
-        </w:rPr>
-        <w:t xml:space="preserve"> </w:t>
-      </w:r>
-      <w:proofErr w:type="spellStart"/>
-      <w:r>
-        <w:rPr>
-          <w:lang w:val="en-US"/>
-        </w:rPr>
-        <w:t>FK_OrderItems_Products</w:t>
-      </w:r>
-      <w:proofErr w:type="spellEnd"/>
-      <w:r>
-        <w:rPr>
-          <w:lang w:val="en-US"/>
-        </w:rPr>
-        <w:t>: FOREIGN KEY (</w:t>
-      </w:r>
-      <w:proofErr w:type="spellStart"/>
-      <w:r>
-        <w:rPr>
-          <w:lang w:val="en-US"/>
-        </w:rPr>
-        <w:t>ProductID</w:t>
-      </w:r>
-      <w:proofErr w:type="spellEnd"/>
-      <w:r>
-        <w:rPr>
-          <w:lang w:val="en-US"/>
-        </w:rPr>
-        <w:t xml:space="preserve">) REFERENCES </w:t>
-      </w:r>
-      <w:proofErr w:type="gramStart"/>
-      <w:r>
-        <w:rPr>
-          <w:lang w:val="en-US"/>
-        </w:rPr>
-        <w:t>Products(</w:t>
-      </w:r>
-      <w:proofErr w:type="spellStart"/>
-      <w:proofErr w:type="gramEnd"/>
-      <w:r>
-        <w:rPr>
-          <w:lang w:val="en-US"/>
-        </w:rPr>
-        <w:t>ProductID</w:t>
-      </w:r>
-      <w:proofErr w:type="spellEnd"/>
-      <w:r>
-        <w:rPr>
-          <w:lang w:val="en-US"/>
-        </w:rPr>
-        <w:t xml:space="preserve">)  </w:t>
       </w:r>
     </w:p>
     <w:p>
@@ -2824,6 +2702,72 @@
         <w:rPr>
           <w:lang w:val="en-US"/>
         </w:rPr>
+        <w:t>FK_OrderItems_Products</w:t>
+      </w:r>
+      <w:proofErr w:type="spellEnd"/>
+      <w:r>
+        <w:rPr>
+          <w:lang w:val="en-US"/>
+        </w:rPr>
+        <w:t>: FOREIGN KEY (</w:t>
+      </w:r>
+      <w:proofErr w:type="spellStart"/>
+      <w:r>
+        <w:rPr>
+          <w:lang w:val="en-US"/>
+        </w:rPr>
+        <w:t>ProductID</w:t>
+      </w:r>
+      <w:proofErr w:type="spellEnd"/>
+      <w:r>
+        <w:rPr>
+          <w:lang w:val="en-US"/>
+        </w:rPr>
+        <w:t xml:space="preserve">) REFERENCES </w:t>
+      </w:r>
+      <w:proofErr w:type="gramStart"/>
+      <w:r>
+        <w:rPr>
+          <w:lang w:val="en-US"/>
+        </w:rPr>
+        <w:t>Products(</w:t>
+      </w:r>
+      <w:proofErr w:type="spellStart"/>
+      <w:proofErr w:type="gramEnd"/>
+      <w:r>
+        <w:rPr>
+          <w:lang w:val="en-US"/>
+        </w:rPr>
+        <w:t>ProductID</w:t>
+      </w:r>
+      <w:proofErr w:type="spellEnd"/>
+      <w:r>
+        <w:rPr>
+          <w:lang w:val="en-US"/>
+        </w:rPr>
+        <w:t xml:space="preserve">)  </w:t>
+      </w:r>
+    </w:p>
+    <w:p>
+      <w:pPr>
+        <w:spacing w:after="0"/>
+        <w:ind w:left="1415" w:firstLine="709"/>
+        <w:jc w:val="both"/>
+        <w:rPr>
+          <w:lang w:val="en-US"/>
+        </w:rPr>
+      </w:pPr>
+      <w:r>
+        <w:rPr>
+          <w:lang w:val="en-US"/>
+        </w:rPr>
+        <w:t xml:space="preserve">▪ </w:t>
+      </w:r>
+      <w:proofErr w:type="spellStart"/>
+      <w:r>
+        <w:rPr>
+          <w:lang w:val="en-US"/>
+        </w:rPr>
         <w:t>CHK_Quantity</w:t>
       </w:r>
       <w:proofErr w:type="spellEnd"/>
@@ -2882,6 +2826,42 @@
           <w:lang w:val="en-US"/>
         </w:rPr>
         <w:t xml:space="preserve"> &gt;= 0)  </w:t>
+      </w:r>
+    </w:p>
+    <w:p>
+      <w:pPr>
+        <w:spacing w:after="0"/>
+        <w:ind w:left="1415" w:firstLine="709"/>
+        <w:jc w:val="both"/>
+        <w:rPr>
+          <w:lang w:val="en-US"/>
+        </w:rPr>
+      </w:pPr>
+      <w:r>
+        <w:rPr>
+          <w:lang w:val="en-US"/>
+        </w:rPr>
+        <w:t>▪</w:t>
+      </w:r>
+      <w:r>
+        <w:rPr>
+          <w:lang w:val="en-US"/>
+        </w:rPr>
+        <w:t xml:space="preserve"> </w:t>
+      </w:r>
+      <w:proofErr w:type="spellStart"/>
+      <w:r>
+        <w:rPr>
+          <w:lang w:val="en-US"/>
+        </w:rPr>
+        <w:t>UQ_OrderItem_OrderProduct</w:t>
+      </w:r>
+      <w:proofErr w:type="spellEnd"/>
+      <w:r>
+        <w:rPr>
+          <w:lang w:val="en-US"/>
+        </w:rPr>
+        <w:t>: UNIQUE (OrderID, ProductID)</w:t>
       </w:r>
     </w:p>
     <w:p>
@@ -3586,36 +3566,12 @@
           <w:szCs w:val="32"/>
           <w:lang w:val="en-US"/>
         </w:rPr>
-        <w:t xml:space="preserve">Part </w:t>
+        <w:t>Part 3: ER-</w:t>
       </w:r>
       <w:r>
         <w:rPr>
           <w:sz w:val="32"/>
           <w:szCs w:val="32"/>
-          <w:lang w:val="en-US"/>
-        </w:rPr>
-        <w:t>3</w:t>
-      </w:r>
-      <w:r>
-        <w:rPr>
-          <w:sz w:val="32"/>
-          <w:szCs w:val="32"/>
-          <w:lang w:val="en-US"/>
-        </w:rPr>
-        <w:t>:</w:t>
-      </w:r>
-      <w:r>
-        <w:rPr>
-          <w:sz w:val="32"/>
-          <w:szCs w:val="32"/>
-          <w:lang w:val="en-US"/>
-        </w:rPr>
-        <w:t xml:space="preserve"> ER-</w:t>
-      </w:r>
-      <w:r>
-        <w:rPr>
-          <w:sz w:val="32"/>
-          <w:szCs w:val="32"/>
         </w:rPr>
         <w:t>диаграмма</w:t>
       </w:r>
@@ -3630,18 +3586,10 @@
           <w:noProof/>
         </w:rPr>
         <w:drawing>
-          <wp:anchor distT="0" distB="0" distL="114300" distR="114300" simplePos="0" relativeHeight="251658240" behindDoc="0" locked="0" layoutInCell="1" allowOverlap="1" wp14:anchorId="01AF6E5C" wp14:editId="216B9250">
-            <wp:simplePos x="0" y="0"/>
-            <wp:positionH relativeFrom="margin">
-              <wp:align>right</wp:align>
-            </wp:positionH>
-            <wp:positionV relativeFrom="margin">
-              <wp:posOffset>6692900</wp:posOffset>
-            </wp:positionV>
-            <wp:extent cx="5939790" cy="2623185"/>
-            <wp:effectExtent l="0" t="0" r="3810" b="5715"/>
-            <wp:wrapSquare wrapText="bothSides"/>
-            <wp:docPr id="339597685" name="Рисунок 1"/>
+          <wp:inline distT="0" distB="0" distL="0" distR="0" wp14:anchorId="492FA1DD" wp14:editId="36FAAD0E">
+            <wp:extent cx="5939790" cy="2030095"/>
+            <wp:effectExtent l="0" t="0" r="3810" b="8255"/>
+            <wp:docPr id="739522585" name="Рисунок 1"/>
             <wp:cNvGraphicFramePr>
               <a:graphicFrameLocks xmlns:a="http://schemas.openxmlformats.org/drawingml/2006/main" noChangeAspect="1"/>
             </wp:cNvGraphicFramePr>
@@ -3649,8 +3597,10 @@
               <a:graphicData uri="http://schemas.openxmlformats.org/drawingml/2006/picture">
                 <pic:pic xmlns:pic="http://schemas.openxmlformats.org/drawingml/2006/picture">
                   <pic:nvPicPr>
-                    <pic:cNvPr id="339597685" name="Рисунок 339597685"/>
-                    <pic:cNvPicPr/>
+                    <pic:cNvPr id="0" name="Picture 1"/>
+                    <pic:cNvPicPr>
+                      <a:picLocks noChangeAspect="1" noChangeArrowheads="1"/>
+                    </pic:cNvPicPr>
                   </pic:nvPicPr>
                   <pic:blipFill>
                     <a:blip r:embed="rId5">
@@ -3660,23 +3610,28 @@
                         </a:ext>
                       </a:extLst>
                     </a:blip>
+                    <a:srcRect/>
                     <a:stretch>
                       <a:fillRect/>
                     </a:stretch>
                   </pic:blipFill>
-                  <pic:spPr>
+                  <pic:spPr bwMode="auto">
                     <a:xfrm>
                       <a:off x="0" y="0"/>
-                      <a:ext cx="5939790" cy="2623185"/>
+                      <a:ext cx="5939790" cy="2030095"/>
                     </a:xfrm>
                     <a:prstGeom prst="rect">
                       <a:avLst/>
                     </a:prstGeom>
+                    <a:noFill/>
+                    <a:ln>
+                      <a:noFill/>
+                    </a:ln>
                   </pic:spPr>
                 </pic:pic>
               </a:graphicData>
             </a:graphic>
-          </wp:anchor>
+          </wp:inline>
         </w:drawing>
       </w:r>
     </w:p>

</xml_diff>